<commit_message>
refactor: switch template placeholders from named to numbered format
Update payment template to use numbered placeholders {1}-{19} matching
the standard Russian banking form ОКУД 0401061 field numbering scheme,
replacing the previous {variable_name} convention. Both TypeScript and
Kotlin backends updated along with tests.

https://claude.ai/code/session_01XDFNunZGYT7mTBJvT7CDSj
</commit_message>
<xml_diff>
--- a/backend-kotlin/src/main/resources/templates/payment_template.docx
+++ b/backend-kotlin/src/main/resources/templates/payment_template.docx
@@ -58,7 +58,7 @@
                 <w:sz w:val="20"/>
                 <w:szCs w:val="20"/>
               </w:rPr>
-              <w:t xml:space="preserve">{document_date}</w:t>
+              <w:t xml:space="preserve">{1}</w:t>
             </w:r>
           </w:p>
         </w:tc>
@@ -218,7 +218,7 @@
           <w:sz w:val="24"/>
           <w:szCs w:val="24"/>
         </w:rPr>
-        <w:t xml:space="preserve">ПЛАТЕЖНОЕ ТРЕБОВАНИЕ № {document_number}</w:t>
+        <w:t xml:space="preserve">ПЛАТЕЖНОЕ ТРЕБОВАНИЕ № {2}</w:t>
       </w:r>
     </w:p>
     <w:tbl>
@@ -262,7 +262,7 @@
                 <w:sz w:val="20"/>
                 <w:szCs w:val="20"/>
               </w:rPr>
-              <w:t xml:space="preserve">{document_date}</w:t>
+              <w:t xml:space="preserve">{1}</w:t>
             </w:r>
           </w:p>
         </w:tc>
@@ -316,7 +316,7 @@
                 <w:sz w:val="20"/>
                 <w:szCs w:val="20"/>
               </w:rPr>
-              <w:t xml:space="preserve">{delivery_type}</w:t>
+              <w:t xml:space="preserve">{3}</w:t>
             </w:r>
           </w:p>
         </w:tc>
@@ -583,7 +583,7 @@
                 <w:sz w:val="20"/>
                 <w:szCs w:val="20"/>
               </w:rPr>
-              <w:t xml:space="preserve">{document_amount_words}</w:t>
+              <w:t xml:space="preserve">{4_words}</w:t>
             </w:r>
           </w:p>
         </w:tc>
@@ -635,7 +635,7 @@
                 <w:sz w:val="20"/>
                 <w:szCs w:val="20"/>
               </w:rPr>
-              <w:t xml:space="preserve">ИНН {payer_inn}</w:t>
+              <w:t xml:space="preserve">ИНН {5}</w:t>
             </w:r>
           </w:p>
         </w:tc>
@@ -689,7 +689,7 @@
                 <w:sz w:val="20"/>
                 <w:szCs w:val="20"/>
               </w:rPr>
-              <w:t xml:space="preserve">{document_amount}</w:t>
+              <w:t xml:space="preserve">{4}</w:t>
             </w:r>
           </w:p>
         </w:tc>
@@ -718,7 +718,7 @@
                 <w:sz w:val="20"/>
                 <w:szCs w:val="20"/>
               </w:rPr>
-              <w:t xml:space="preserve">{payer_name}</w:t>
+              <w:t xml:space="preserve">{6}</w:t>
             </w:r>
           </w:p>
         </w:tc>
@@ -801,7 +801,7 @@
                 <w:sz w:val="20"/>
                 <w:szCs w:val="20"/>
               </w:rPr>
-              <w:t xml:space="preserve">Сч. № {payer_account}</w:t>
+              <w:t xml:space="preserve">Сч. № {7}</w:t>
             </w:r>
           </w:p>
         </w:tc>
@@ -990,7 +990,7 @@
                 <w:sz w:val="20"/>
                 <w:szCs w:val="20"/>
               </w:rPr>
-              <w:t xml:space="preserve">{payer_bank}</w:t>
+              <w:t xml:space="preserve">{10}</w:t>
             </w:r>
           </w:p>
         </w:tc>
@@ -1044,7 +1044,7 @@
                 <w:sz w:val="20"/>
                 <w:szCs w:val="20"/>
               </w:rPr>
-              <w:t xml:space="preserve">{payer_bank_bik}</w:t>
+              <w:t xml:space="preserve">{8}</w:t>
             </w:r>
           </w:p>
         </w:tc>
@@ -1127,7 +1127,7 @@
                 <w:sz w:val="20"/>
                 <w:szCs w:val="20"/>
               </w:rPr>
-              <w:t xml:space="preserve">{payer_corr_account}</w:t>
+              <w:t xml:space="preserve">{9}</w:t>
             </w:r>
           </w:p>
         </w:tc>
@@ -1262,7 +1262,7 @@
                 <w:sz w:val="20"/>
                 <w:szCs w:val="20"/>
               </w:rPr>
-              <w:t xml:space="preserve">{recipient_bank_name}</w:t>
+              <w:t xml:space="preserve">{11}</w:t>
             </w:r>
           </w:p>
         </w:tc>
@@ -1316,7 +1316,7 @@
                 <w:sz w:val="20"/>
                 <w:szCs w:val="20"/>
               </w:rPr>
-              <w:t xml:space="preserve">{recipient_bik}</w:t>
+              <w:t xml:space="preserve">{12}</w:t>
             </w:r>
           </w:p>
         </w:tc>
@@ -1399,7 +1399,7 @@
                 <w:sz w:val="20"/>
                 <w:szCs w:val="20"/>
               </w:rPr>
-              <w:t xml:space="preserve">{recipient_corr_account}</w:t>
+              <w:t xml:space="preserve">{13}</w:t>
             </w:r>
           </w:p>
         </w:tc>
@@ -1534,7 +1534,7 @@
                 <w:sz w:val="20"/>
                 <w:szCs w:val="20"/>
               </w:rPr>
-              <w:t xml:space="preserve">ИНН {recipient_inn}</w:t>
+              <w:t xml:space="preserve">ИНН {15}</w:t>
             </w:r>
           </w:p>
         </w:tc>
@@ -1588,7 +1588,7 @@
                 <w:sz w:val="20"/>
                 <w:szCs w:val="20"/>
               </w:rPr>
-              <w:t xml:space="preserve">{recipient_account}</w:t>
+              <w:t xml:space="preserve">{14}</w:t>
             </w:r>
           </w:p>
         </w:tc>
@@ -1617,7 +1617,7 @@
                 <w:sz w:val="20"/>
                 <w:szCs w:val="20"/>
               </w:rPr>
-              <w:t xml:space="preserve">{recipient_bank}</w:t>
+              <w:t xml:space="preserve">{16}</w:t>
             </w:r>
           </w:p>
         </w:tc>
@@ -1834,7 +1834,7 @@
                 <w:sz w:val="20"/>
                 <w:szCs w:val="20"/>
               </w:rPr>
-              <w:t xml:space="preserve">{operation_type}</w:t>
+              <w:t xml:space="preserve">{17}</w:t>
             </w:r>
           </w:p>
         </w:tc>
@@ -1888,7 +1888,7 @@
                 <w:sz w:val="20"/>
                 <w:szCs w:val="20"/>
               </w:rPr>
-              <w:t xml:space="preserve">{payment_priority}</w:t>
+              <w:t xml:space="preserve">{18}</w:t>
             </w:r>
           </w:p>
         </w:tc>
@@ -2036,7 +2036,7 @@
           <w:sz w:val="20"/>
           <w:szCs w:val="20"/>
         </w:rPr>
-        <w:t xml:space="preserve">{payment_purpose}</w:t>
+        <w:t xml:space="preserve">{19}</w:t>
       </w:r>
     </w:p>
     <w:p>
@@ -2572,7 +2572,7 @@
                 <w:sz w:val="20"/>
                 <w:szCs w:val="20"/>
               </w:rPr>
-              <w:t xml:space="preserve">{document_date}</w:t>
+              <w:t xml:space="preserve">{1}</w:t>
             </w:r>
           </w:p>
         </w:tc>

</xml_diff>